<commit_message>
No changes provided to summarize.
</commit_message>
<xml_diff>
--- a/АСУСН/ЛР2/ГайнановДИГарифуллинКР_ЛР2_АСУСН_v2.docx
+++ b/АСУСН/ЛР2/ГайнановДИГарифуллинКР_ЛР2_АСУСН_v2.docx
@@ -2374,14 +2374,15 @@
               <w:jc w:val="center"/>
               <w:rPr>
                 <w:color w:val="auto"/>
-              </w:rPr>
-            </w:pPr>
-            <w:r>
-              <w:rPr>
-                <w:color w:val="auto"/>
-                <w:sz w:val="21"/>
-              </w:rPr>
-              <w:t>– (k_инт=0.1 с⁻¹)</w:t>
+                <w:lang w:val="ru-RU"/>
+              </w:rPr>
+            </w:pPr>
+            <w:r>
+              <w:rPr>
+                <w:color w:val="auto"/>
+                <w:lang w:val="ru-RU"/>
+              </w:rPr>
+              <w:t>–</w:t>
             </w:r>
           </w:p>
         </w:tc>
@@ -12475,6 +12476,7 @@
               <w:spacing w:before="40" w:after="40"/>
               <w:rPr>
                 <w:color w:val="auto"/>
+                <w:lang w:val="ru-RU"/>
               </w:rPr>
             </w:pPr>
             <w:r>

</xml_diff>